<commit_message>
Pitch CGI : repositionnement client-first (rachat en option)
Le deck et la fiche de prep visent désormais en priorité CGI comme CLIENT
(adoption + déploiement en abonnement sur ses entités). Partenariat et
acquisition deviennent des options ultérieures (slide « Et après »). Narratif,
ROI, posture, Q&A et demande ajustés en conséquence.
</commit_message>
<xml_diff>
--- a/deliverables/Konsilys_Preparation_RDV_CGI.docx
+++ b/deliverables/Konsilys_Preparation_RDV_CGI.docx
@@ -44,7 +44,7 @@
           <w:color w:val="2F6F3E"/>
           <w:sz w:val="26"/>
         </w:rPr>
-        <w:t>Présenter &amp; positionner Konsilys pour un partenariat / rachat</w:t>
+        <w:t>Présenter Konsilys &amp; faire de CGI un client (partenariat / rachat en option)</w:t>
       </w:r>
     </w:p>
     <w:p/>
@@ -96,7 +96,7 @@
           <w:i w:val="0"/>
           <w:sz w:val="21"/>
         </w:rPr>
-        <w:t>Tu présentes Konsilys — plateforme SaaS de pilotage d'ESN, déjà en production — à trois dirigeants de CGI, ton employeur et l'une des plus grandes ESN mondiales. Objectif visé : un partenariat ou le rachat du produit (et éventuellement de l'équipe).</w:t>
+        <w:t>Tu présentes Konsilys — plateforme SaaS de pilotage d'ESN, déjà en production — à trois dirigeants de CGI, ton employeur et l'une des plus grandes ESN mondiales. Objectif prioritaire : faire de CGI un client — l'adoption de Konsilys comme solution, déployée sur ses entités, en abonnement. Un partenariat ou un rachat ne sont que des options ultérieures, à évoquer seulement si eux ouvrent le sujet.</w:t>
       </w:r>
     </w:p>
     <w:p>
@@ -107,7 +107,7 @@
           <w:i/>
           <w:sz w:val="21"/>
         </w:rPr>
-        <w:t>Le récit gagnant : « CGI peut, dès aujourd'hui, tirer parti d'un actif SaaS prêt — pour gagner en agilité en interne (filiales, acquisitions, BU) et pour l'ajouter à son offre — au lieu de le construire. »</w:t>
+        <w:t>Le récit gagnant : « CGI peut, dès aujourd'hui, déployer une solution prête pour piloter ses entités mal servies par le SI groupe — en quelques jours, sans projet lourd, et sans risque grâce à un pilote. »</w:t>
       </w:r>
     </w:p>
     <w:tbl>
@@ -141,7 +141,7 @@
                 <w:rFonts w:ascii="Calibri" w:hAnsi="Calibri"/>
                 <w:sz w:val="20"/>
               </w:rPr>
-              <w:t>ne survends pas. Montre un produit réel, écoute leurs enjeux, et propose de dérisquer par un pilote. Un pilote crédible vaut mieux qu'une promesse d'acquisition.</w:t>
+              <w:t>ne survends pas et ne demande pas un rachat. Montre un produit réel, écoute leurs enjeux, et propose de dérisquer par un pilote. Un « oui » sur un pilote vaut mieux qu'une discussion prématurée d'acquisition.</w:t>
             </w:r>
           </w:p>
         </w:tc>
@@ -201,7 +201,7 @@
                 <w:rFonts w:ascii="Calibri" w:hAnsi="Calibri"/>
                 <w:sz w:val="20"/>
               </w:rPr>
-              <w:t>Tu es salarié de CGI. Selon ton contrat (clause de PI) et les conditions de développement (temps/ressources personnels, aucune donnée ou code CGI), CGI pourrait déjà détenir des droits sur Konsilys — ce qui change tout dans une négociation de rachat.</w:t>
+              <w:t>Tu es salarié de CGI. Selon ton contrat (clause de PI) et les conditions de développement (temps/ressources personnels, aucune donnée ou code CGI), CGI pourrait considérer avoir des droits sur Konsilys. Le point vaut même pour une relation client (« pourquoi payer un abonnement pour un outil qu'un salarié a construit ? »). Clarifie ta position avant, quel que soit le scénario.</w:t>
             </w:r>
           </w:p>
         </w:tc>
@@ -690,7 +690,7 @@
                 <w:b w:val="0"/>
                 <w:sz w:val="19"/>
               </w:rPr>
-              <w:t>« Combien ça vaut / structure du deal ? »</w:t>
+              <w:t>« Combien ça coûte / quel ROI ? »</w:t>
             </w:r>
           </w:p>
         </w:tc>
@@ -709,7 +709,7 @@
                 <w:b w:val="0"/>
                 <w:sz w:val="19"/>
               </w:rPr>
-              <w:t>Ne lance pas un prix. Oriente vers un pilote qui prouve la valeur, puis une valorisation fondée sur des faits (traction, coût de reconstruction, synergies). Prépare une fourchette et une logique, pas un chiffre isolé.</w:t>
+              <w:t>Modèle SaaS par licence (par rôle et par siège) : ils ne paient que l'usage réel, entité par entité, sans coût d'intégration. Positionne le prix face au temps managérial gagné et à la marge mieux pilotée ; propose de le chiffrer sur le pilote.</w:t>
             </w:r>
           </w:p>
         </w:tc>
@@ -731,6 +731,47 @@
                 <w:b w:val="0"/>
                 <w:sz w:val="19"/>
               </w:rPr>
+              <w:t>« Et si on veut aller plus loin (partenariat, rachat) ? »</w:t>
+            </w:r>
+          </w:p>
+        </w:tc>
+        <w:tc>
+          <w:tcPr>
+            <w:tcW w:type="dxa" w:w="6048"/>
+            <w:shd w:val="clear" w:color="auto" w:fill="F7F9FB"/>
+          </w:tcPr>
+          <w:p>
+            <w:pPr>
+              <w:spacing w:after="40" w:before="40"/>
+            </w:pPr>
+            <w:r/>
+            <w:r>
+              <w:rPr>
+                <w:rFonts w:ascii="Calibri" w:hAnsi="Calibri"/>
+                <w:b w:val="0"/>
+                <w:sz w:val="19"/>
+              </w:rPr>
+              <w:t>Reste ouvert sans le provoquer : « commençons par prouver la valeur sur une entité ; si ça a du sens, on pourra parler distribution ou reprise ». L'acquisition est une option qu'ils ouvrent, pas ta demande.</w:t>
+            </w:r>
+          </w:p>
+        </w:tc>
+      </w:tr>
+      <w:tr>
+        <w:tc>
+          <w:tcPr>
+            <w:tcW w:type="dxa" w:w="3312"/>
+          </w:tcPr>
+          <w:p>
+            <w:pPr>
+              <w:spacing w:after="40" w:before="40"/>
+            </w:pPr>
+            <w:r/>
+            <w:r>
+              <w:rPr>
+                <w:rFonts w:ascii="Calibri" w:hAnsi="Calibri"/>
+                <w:b w:val="0"/>
+                <w:sz w:val="19"/>
+              </w:rPr>
               <w:t>« Et nos données / clients existants ? »</w:t>
             </w:r>
           </w:p>
@@ -738,7 +779,6 @@
         <w:tc>
           <w:tcPr>
             <w:tcW w:type="dxa" w:w="6048"/>
-            <w:shd w:val="clear" w:color="auto" w:fill="F7F9FB"/>
           </w:tcPr>
           <w:p>
             <w:pPr>
@@ -858,14 +898,36 @@
           <w:color w:val="1B2B3A"/>
           <w:sz w:val="21"/>
         </w:rPr>
-        <w:t xml:space="preserve">Reste factuel sur la valeur. </w:t>
+        <w:t xml:space="preserve">Vends la solution, pas l'entreprise. </w:t>
       </w:r>
       <w:r>
         <w:rPr>
           <w:rFonts w:ascii="Calibri" w:hAnsi="Calibri"/>
           <w:sz w:val="21"/>
         </w:rPr>
-        <w:t>Pas de valorisation au hasard ; parle synergies et preuve d'usage.</w:t>
+        <w:t>Tu proposes un outil à adopter, pas un rachat. Si eux ouvrent le sujet partenariat/acquisition, accueille-le ; sinon reste sur le pilote et le déploiement.</w:t>
+      </w:r>
+    </w:p>
+    <w:p>
+      <w:pPr>
+        <w:pStyle w:val="ListBullet"/>
+        <w:spacing w:after="60"/>
+      </w:pPr>
+      <w:r>
+        <w:rPr>
+          <w:rFonts w:ascii="Calibri" w:hAnsi="Calibri"/>
+          <w:b/>
+          <w:color w:val="1B2B3A"/>
+          <w:sz w:val="21"/>
+        </w:rPr>
+        <w:t xml:space="preserve">Parle ROI, pas valorisation. </w:t>
+      </w:r>
+      <w:r>
+        <w:rPr>
+          <w:rFonts w:ascii="Calibri" w:hAnsi="Calibri"/>
+          <w:sz w:val="21"/>
+        </w:rPr>
+        <w:t>Chiffre la valeur pour eux (temps gagné, marge pilotée) et un prix d'abonnement simple ; garde la valorisation du produit pour plus tard.</w:t>
       </w:r>
     </w:p>
     <w:p>
@@ -1413,7 +1475,7 @@
                 <w:b w:val="0"/>
                 <w:sz w:val="19"/>
               </w:rPr>
-              <w:t>Logique de valorisation (fourchette + raisonnement)</w:t>
+              <w:t>Grille de prix simple pour le pilote (par licence/entité)</w:t>
             </w:r>
           </w:p>
         </w:tc>
@@ -1433,7 +1495,7 @@
                 <w:b w:val="0"/>
                 <w:sz w:val="19"/>
               </w:rPr>
-              <w:t>Ne pas être pris au dépourvu sur le prix.</w:t>
+              <w:t>Répondre au « combien ça coûte » sans hésiter.</w:t>
             </w:r>
           </w:p>
         </w:tc>
@@ -1481,7 +1543,7 @@
           <w:i w:val="0"/>
           <w:sz w:val="21"/>
         </w:rPr>
-        <w:t>Opportunité pour CGI : (1) agilité interne pour filiales/acquisitions/BU sans toucher à l'ERP ; (2) actif produit à distribuer ou intégrer à l'offre.</w:t>
+        <w:t>Opportunité pour CGI : déployer une solution prête sur ses entités mal servies par le SI groupe (filiales, acquisitions, BU) — agilité immédiate, sans projet lourd. Partenariat ou reprise : options ouvertes pour plus tard.</w:t>
       </w:r>
     </w:p>
     <w:p>
@@ -1492,7 +1554,7 @@
           <w:i w:val="0"/>
           <w:sz w:val="21"/>
         </w:rPr>
-        <w:t>Demande : un pilote cadré sur une entité, puis discussion d'un partenariat ou d'une acquisition.</w:t>
+        <w:t>Demande : un pilote cadré sur une entité volontaire, puis déploiement comme client si concluant.</w:t>
       </w:r>
     </w:p>
     <w:p>

</xml_diff>